<commit_message>
Ações de mobilização no projeto, folhas de rifa para impressão e controle da rifa
- projeto: intervenção no pátio, caixas em comércios locais, peças de grande formato
- gerar_rifas.py: 2400 bilhetes, 5 por folha (6 folhas por aluno), QR do Instagram
- gerar_controle_rifa.py: distribuição, vendas, balanço por aluno, resumo
- formulario-vendas.md: especificação do Google Forms e rotina da comissão

Co-Authored-By: Claude Opus 5.5 <noreply@anthropic.com>
Claude-Session: https://claude.ai/code/session_01MBn9YrntdXfTASAVKo9hpN
</commit_message>
<xml_diff>
--- a/entregas/projeto-escrito.docx
+++ b/entregas/projeto-escrito.docx
@@ -1361,6 +1361,20 @@
                 <w:i w:val="0"/>
                 <w:color w:val="444444"/>
               </w:rPr>
+              <w:t>Ações de mobilização para a arrecadação. Para chamar a atenção da comunidade e ampliar as doações, serão realizadas: (1) intervenção visual no pátio do campus, com cenário temático montado com a identidade visual do projeto, exposição dos cinco itens aceitos, informações sobre o "efeito rebote" e caixa de coleta, com acadêmicos em escala para explicar o projeto ao público; (2) caixas de coleta personalizadas em comércios locais de Maringá, instaladas com autorização do responsável por cada estabelecimento e recolhidas semanalmente pela equipe de Logística e Arrecadação; e (3) peças de grande formato, como banners e faixas no campus, produzidas com a cota de impressão institucional — a veiculação em outdoor somente ocorrerá se houver cessão gratuita do espaço, preservando a estratégia de custo zero. Todas as ações dependem de autorização prévia da professora responsável e da instituição, e o cenário evitará qualquer representação sensacionalista ou estigmatizante das pessoas privadas de liberdade.</w:t>
+            </w:r>
+          </w:p>
+          <w:p>
+            <w:pPr>
+              <w:spacing w:before="80"/>
+              <w:jc w:val="both"/>
+            </w:pPr>
+            <w:r>
+              <w:rPr>
+                <w:b w:val="0"/>
+                <w:i w:val="0"/>
+                <w:color w:val="444444"/>
+              </w:rPr>
               <w:t>Rifa solidária. Como forma complementar de arrecadação, será realizada uma rifa com bilhetes numerados de 0001 a 2400, ao valor de R$ 5,00 cada. Cada acadêmico receberá um bloco de 30 bilhetes numerados em sequência, vendidos em sua rede de contatos, o que distribui a responsabilidade de forma igualitária e dispensa a organização de eventos. Para que a rifa também cumpra função de conscientização, cada bilhete trará o perfil do projeto no Instagram (@efeitorebote.oficial) e um QR Code de acesso a ele, de modo que o comprador, ao guardar o bilhete, tenha acesso ao conteúdo informativo do projeto. Como cada acadêmico vende de forma independente, o controle é centralizado em meio digital: a cada venda, o vendedor preenche o canhoto e registra, no mesmo dia, o número do bilhete, o nome e o telefone do comprador e a forma de pagamento em formulário on-line único, que constitui o registro oficial da rifa. O pagamento é feito preferencialmente por PIX diretamente na conta da comissão financeira, com o número do bilhete na descrição, de modo que o dinheiro não fique com o vendedor; valores em espécie são entregues à comissão nos acertos semanais, realizados às segundas-feiras nos encontros, quando o registro é conferido com os extratos. Somente participam do sorteio os bilhetes registrados e pagos até 30/10/2026, às 23h59; a lista dos números participantes, sem dados pessoais, é publicada no perfil do projeto em 01/11/2026. O prêmio será um tablet Samsung Galaxy Tab A11+ (11 polegadas, Wi-Fi) ou modelo equivalente. O sorteio ocorrerá em 02/11/2026, às [PENDENTE: horário], com transmissão ao vivo no @efeitorebote.oficial: os números da lista oficial são impressos, dobrados e depositados em urna, e um número é retirado na presença da professora responsável e de duas testemunhas, com lavratura de ata; por ser transmitido on-line, o sorteio independe do funcionamento do campus. Os valores arrecadados, deduzido o custo de aquisição do prêmio, serão destinados exclusivamente à compra dos itens listados, com comprovação por nota fiscal e prestação de contas à professora responsável e à turma. A realização da rifa está condicionada à autorização da instituição, observadas as normas institucionais e a legislação aplicável; o regulamento completo consta do Anexo 1.</w:t>
             </w:r>
           </w:p>
@@ -2341,7 +2355,7 @@
                 <w:i w:val="0"/>
                 <w:color w:val="444444"/>
               </w:rPr>
-              <w:t>ENCONTRO 7 – Acompanhamento da Arrecadação e da Rifa</w:t>
+              <w:t>ENCONTRO 7 – Intervenção no Pátio e Acompanhamento da Arrecadação</w:t>
             </w:r>
           </w:p>
           <w:p>
@@ -2383,7 +2397,7 @@
                 <w:i w:val="0"/>
                 <w:color w:val="444444"/>
               </w:rPr>
-              <w:t>Monitorar o andamento da campanha e garantir a transparência no controle de itens e valores.</w:t>
+              <w:t>Dar visibilidade à campanha no campus e monitorar o andamento da arrecadação e da rifa.</w:t>
             </w:r>
           </w:p>
           <w:p>
@@ -2404,7 +2418,7 @@
                 <w:i w:val="0"/>
                 <w:color w:val="444444"/>
               </w:rPr>
-              <w:t>Recolhimento e triagem semanal dos itens; atualização da planilha de controle; acerto parcial de valores e canhotos da rifa com a comissão financeira; ajuste das estratégias de divulgação.</w:t>
+              <w:t>Montagem do cenário temático no pátio do campus, com exposição dos itens aceitos, caixa de coleta e escala de acadêmicos para atendimento ao público; recolhimento e triagem semanal dos itens do campus e dos comércios parceiros; acerto semanal da rifa com a comissão financeira.</w:t>
             </w:r>
           </w:p>
           <w:p>
@@ -2425,7 +2439,7 @@
                 <w:i w:val="0"/>
                 <w:color w:val="444444"/>
               </w:rPr>
-              <w:t>Relatório descritivo das tarefas assumidas na arrecadação.</w:t>
+              <w:t>Relatório descritivo da participação na intervenção ou na arrecadação.</w:t>
             </w:r>
           </w:p>
           <w:p/>

</xml_diff>

<commit_message>
Objetivo específico: identificar o efeito rebote em vez de comprovar/correlacionar
- registra a reformulação nos ajustes em relação ao pré-projeto

Co-Authored-By: Claude Opus 5.5 <noreply@anthropic.com>
Claude-Session: https://claude.ai/code/session_01MBn9YrntdXfTASAVKo9hpN
</commit_message>
<xml_diff>
--- a/entregas/projeto-escrito.docx
+++ b/entregas/projeto-escrito.docx
@@ -952,7 +952,7 @@
                 <w:i w:val="0"/>
                 <w:color w:val="444444"/>
               </w:rPr>
-              <w:t>Objetivos específicos: (1) analisar, durante as visitas técnicas, a estrutura das unidades e a aplicação prática da LEP, com foco na assistência material; (2) correlacionar a omissão no fornecimento de itens básicos com a elevação dos custos sociais, institucionais e de saúde pública; (3) produzir conteúdo informativo para as redes sociais e materiais de comunicação visual que sensibilizem a comunidade sobre a realidade prisional; (4) executar campanha de arrecadação com meta superior a 8.000 itens de higiene, encerrando o ciclo com a entrega nas unidades; (5) estimular a responsabilidade social, o trabalho em equipe e a empatia dos acadêmicos envolvidos.</w:t>
+              <w:t>Objetivos específicos: (1) analisar, durante as visitas técnicas, a estrutura das unidades e a aplicação prática da LEP, com foco na assistência material; (2) identificar a ocorrência do fenômeno "efeito rebote" como problema social, a partir da literatura e das observações realizadas nas visitas técnicas; (3) produzir conteúdo informativo para as redes sociais e materiais de comunicação visual que sensibilizem a comunidade sobre a realidade prisional; (4) executar campanha de arrecadação com meta superior a 8.000 itens de higiene, encerrando o ciclo com a entrega nas unidades; (5) estimular a responsabilidade social, o trabalho em equipe e a empatia dos acadêmicos envolvidos.</w:t>
             </w:r>
           </w:p>
         </w:tc>
@@ -1459,7 +1459,7 @@
                 <w:i w:val="0"/>
                 <w:color w:val="444444"/>
               </w:rPr>
-              <w:t>Ajustes em relação ao pré-projeto aprovado. Esta versão mantém a fundamentação, os objetivos e a meta de referência de mais de 8.000 itens do pré-projeto (Anexo 3) e incorpora: (1) a lista atualizada de itens, que acrescenta o sabão em pó e define o limite de cada produto; como o pré-projeto especificava creme dental branco, a lista final — tipo, cor, embalagem e forma de entrega — será validada com a PEM, a CCM e a CPIM antes de qualquer aquisição; (2) a rifa solidária como fonte complementar de recursos: a divulgação permanece de custo zero, e a receita da rifa, deduzido o prêmio, destina-se exclusivamente à compra de itens; (3) as ações de mobilização e junto à sociedade; e (4) o sistema on-line de controle de vendas e prestação de contas. O quantitativo arrecadado será acompanhado semanalmente em relação à meta.</w:t>
+              <w:t>Ajustes em relação ao pré-projeto aprovado. Esta versão mantém a fundamentação, os objetivos e a meta de referência de mais de 8.000 itens do pré-projeto (Anexo 3) e incorpora: (1) a lista atualizada de itens, que acrescenta o sabão em pó e define o limite de cada produto; como o pré-projeto especificava creme dental branco, a lista final — tipo, cor, embalagem e forma de entrega — será validada com a PEM, a CCM e a CPIM antes de qualquer aquisição; (2) a rifa solidária como fonte complementar de recursos: a divulgação permanece de custo zero, e a receita da rifa, deduzido o prêmio, destina-se exclusivamente à compra de itens; (3) as ações de mobilização e junto à sociedade; (4) o sistema on-line de controle de vendas e prestação de contas; e (5) a reformulação do objetivo específico relativo ao "efeito rebote", que passa de comprovar para identificar o fenômeno, uma vez que sua comprovação exigiria levantamento de dados de custos públicos alheio ao escopo da ação extensionista. O quantitativo arrecadado será acompanhado semanalmente em relação à meta.</w:t>
             </w:r>
           </w:p>
         </w:tc>

</xml_diff>

<commit_message>
Projeto: objetivos da turma, justificativa com literatura científica e referências; roteiro do relatório final
Co-Authored-By: Claude Opus 5.5 <noreply@anthropic.com>
Claude-Session: https://claude.ai/code/session_01MBn9YrntdXfTASAVKo9hpN
</commit_message>
<xml_diff>
--- a/entregas/projeto-escrito.docx
+++ b/entregas/projeto-escrito.docx
@@ -875,7 +875,7 @@
                 <w:i w:val="0"/>
                 <w:color w:val="444444"/>
               </w:rPr>
-              <w:t>O sistema carcerário brasileiro atravessa uma crise estrutural reconhecida pelo Supremo Tribunal Federal, no julgamento da ADPF 347, como um "estado de coisas inconstitucional", marcado pela superlotação, por um déficit superior a 200 mil vagas segundo dados da Secretaria Nacional de Políticas Penais (SENAPPEN) e pela violação sistemática de direitos fundamentais. A Lei de Execução Penal (Lei nº 7.210/1984) determina, em seus arts. 12 e 14, a obrigatoriedade da assistência material e da assistência à saúde, e, em seu art. 41, assegura esses direitos à pessoa presa. Na prática, contudo, a insuficiência de itens básicos de higiene agrava as condições sanitárias das unidades e transfere indevidamente às famílias um encargo que caberia ao Estado.</w:t>
+              <w:t>A extensão universitária integra, ao lado do ensino e da pesquisa, o tripé da educação superior brasileira: a Constituição Federal, em seu art. 207, estabelece a indissociabilidade entre ensino, pesquisa e extensão. A Resolução CNE/CES nº 7/2018, que regulamenta a Meta 12.7 do Plano Nacional de Educação (Lei nº 13.005/2014), determina que as atividades de extensão componham no mínimo 10% da carga horária curricular dos cursos de graduação e orienta que sejam dirigidas prioritariamente a áreas de grande pertinência social. No curso de Direito, essa vivência permite ao acadêmico compreender a aplicação prática das normas jurídicas e os efeitos que delas decorrem sobre a vida das pessoas.</w:t>
             </w:r>
           </w:p>
           <w:p>
@@ -889,7 +889,7 @@
                 <w:i w:val="0"/>
                 <w:color w:val="444444"/>
               </w:rPr>
-              <w:t>Esse ciclo é o que o projeto denomina "efeito rebote": a omissão no fornecimento de itens preventivos de baixo custo gera despesas muito superiores com internações na rede pública, escoltas para atendimento externo e gestão de crises, além de comprometer a regularidade das visitas familiares, cujo vínculo é reconhecido como um dos principais fatores de redução da reincidência. Ao mesmo tempo, a formação jurídica ainda enfrenta a dissociação entre a teoria estudada em sala e a realidade da execução penal, frequentemente percebida pela sociedade de forma estigmatizada e sensacionalista.</w:t>
+              <w:t>O sistema carcerário brasileiro atravessa uma crise estrutural reconhecida pelo Supremo Tribunal Federal, no julgamento da ADPF 347, como um "estado de coisas inconstitucional". A Lei de Execução Penal (Lei nº 7.210/1984) assegura à pessoa presa assistência material e assistência à saúde de caráter preventivo e curativo (arts. 12, 14 e 41). A literatura científica, contudo, documenta escassez crônica de insumos básicos de higiene nas unidades prisionais, o que submete os custodiados a condições degradantes de habitação e convivência (SÁ et al., 2008; MINAYO; RIBEIRO, 2016; LÔBO et al., 2022). Diante dessa insuficiência, os familiares frequentemente assumem o custo dos itens de higiene e dos medicamentos de uso rotineiro (SÁ et al., 2008; MINAYO; RIBEIRO, 2016).</w:t>
             </w:r>
           </w:p>
           <w:p>
@@ -903,7 +903,35 @@
                 <w:i w:val="0"/>
                 <w:color w:val="444444"/>
               </w:rPr>
-              <w:t>Justifica-se, assim, uma ação extensionista que aproxime os estudantes da realidade das unidades prisionais de Maringá, articule os conteúdos de Direito Penal, Prática Penal e Execução Penal com uma intervenção concreta e ofereça à comunidade uma resposta prática por meio da arrecadação e entrega de itens de higiene, em consonância com os princípios da dignidade da pessoa humana (CF, art. 1º, III) e da intranscendência da pena.</w:t>
+              <w:t>Os estudos indicam que a higiene precária mantém associação multifatorial com o adoecimento no cárcere, atuando em conjunto com a superlotação, a ventilação inadequada e a alimentação deficiente (GOIS et al., 2012; MINAYO; RIBEIRO, 2016). Em inquérito com 1.573 presos do Rio de Janeiro, Minayo e Ribeiro (2016) registraram elevada prevalência autorreferida de doenças de pele, com destaque para alergias e dermatites (43,4%). Quando o preso adoece, o Estado mobiliza atendimento interno, medicamentos, exames, agentes prisionais, escoltas e a rede externa do SUS; em unidades paulistas, a falta de escolta foi o problema mais citado nos encaminhamentos de saúde, relatado por 76,8% das penitenciárias masculinas (FERNANDES et al., 2014). Esses estudos, porém, não apresentam valores em reais nem comparam o custo da prevenção com o do tratamento; por isso, o projeto trata a relação entre prevenção e redução de custos como hipótese, e não como fato comprovado.</w:t>
+            </w:r>
+          </w:p>
+          <w:p>
+            <w:pPr>
+              <w:spacing w:before="80"/>
+              <w:jc w:val="both"/>
+            </w:pPr>
+            <w:r>
+              <w:rPr>
+                <w:b w:val="0"/>
+                <w:i w:val="0"/>
+                <w:color w:val="444444"/>
+              </w:rPr>
+              <w:t>Nesse contexto, o projeto utiliza a expressão "efeito rebote" como categoria de análise para compreender o encadeamento de consequências decorrentes da insuficiência da assistência material: a ausência de itens básicos de higiene pode contribuir para o agravamento das condições sanitárias, gerando demandas posteriores de maior complexidade que retornam ao próprio Estado (atendimentos, deslocamentos e escoltas) e que alcançam também as famílias, sobre as quais recai parte dos custos, com prejuízo à manutenção dos vínculos durante o cumprimento da pena.</w:t>
+            </w:r>
+          </w:p>
+          <w:p>
+            <w:pPr>
+              <w:spacing w:before="80"/>
+              <w:jc w:val="both"/>
+            </w:pPr>
+            <w:r>
+              <w:rPr>
+                <w:b w:val="0"/>
+                <w:i w:val="0"/>
+                <w:color w:val="444444"/>
+              </w:rPr>
+              <w:t>A intervenção proposta não pretende solucionar o problema estrutural da assistência material no sistema prisional nem substituir a responsabilidade estatal pela garantia desses direitos. A arrecadação e a entrega de materiais de higiene constituem uma intervenção pontual, voltada à mitigação de uma das consequências concretas dessa insuficiência, que permite aos acadêmicos observar na prática os efeitos sociais e institucionais do problema estudado e relacioná-los aos conteúdos de Direito Penal, Direito Processual Penal e Execução Penal.</w:t>
             </w:r>
           </w:p>
         </w:tc>
@@ -952,7 +980,7 @@
                 <w:i w:val="0"/>
                 <w:color w:val="444444"/>
               </w:rPr>
-              <w:t>Objetivos específicos: (1) analisar, durante as visitas técnicas, a estrutura das unidades e a aplicação prática da LEP, com foco na assistência material; (2) identificar a ocorrência do fenômeno "efeito rebote" como problema social, a partir da literatura e das observações realizadas nas visitas técnicas; (3) produzir conteúdo informativo para as redes sociais e materiais de comunicação visual que sensibilizem a comunidade sobre a realidade prisional; (4) executar campanha de arrecadação com meta superior a 8.000 itens de higiene, encerrando o ciclo com a entrega nas unidades; (5) estimular a responsabilidade social, o trabalho em equipe e a empatia dos acadêmicos envolvidos.</w:t>
+              <w:t>Objetivos específicos: (1) avaliar condições que coloquem apenados em situação de risco; (2) promover o acolhimento às famílias daqueles em reclusão; (3) realizar busca e arrecadação de insumos conforme a necessidade das instituições PEM, CCM e CPIM; (4) promover campanhas de doação para as instituições PEM, CCM e CPIM; (5) estimular nos acadêmicos de Direito o pensamento crítico, humanístico e de cidadania; e (6) promover na sociedade em geral a responsabilidade social.</w:t>
             </w:r>
           </w:p>
         </w:tc>
@@ -1016,6 +1044,20 @@
                 <w:color w:val="444444"/>
               </w:rPr>
               <w:t>Atitudes: empatia e compreensão humanizada da realidade prisional, superando estigmas; responsabilidade social e compromisso com a dignidade da pessoa humana; ética e transparência no manejo de doações e recursos; postura respeitosa e observância das normas de segurança durante as visitas técnicas.</w:t>
+            </w:r>
+          </w:p>
+          <w:p>
+            <w:pPr>
+              <w:spacing w:before="80"/>
+              <w:jc w:val="both"/>
+            </w:pPr>
+            <w:r>
+              <w:rPr>
+                <w:b w:val="0"/>
+                <w:i w:val="0"/>
+                <w:color w:val="444444"/>
+              </w:rPr>
+              <w:t>A participação nas etapas de pesquisa, organização, arrecadação, triagem, visitas técnicas e entrega aproxima os acadêmicos de uma realidade conhecida, em geral, apenas pela legislação, pela doutrina e pelos estudos acadêmicos, ampliando a compreensão da diferença entre a previsão formal de direitos e sua efetiva concretização no sistema prisional.</w:t>
             </w:r>
           </w:p>
         </w:tc>
@@ -1459,7 +1501,168 @@
                 <w:i w:val="0"/>
                 <w:color w:val="444444"/>
               </w:rPr>
-              <w:t>Ajustes em relação ao pré-projeto aprovado. Esta versão mantém a fundamentação, os objetivos e a meta de referência de mais de 8.000 itens do pré-projeto (Anexo 3) e incorpora: (1) a lista atualizada de itens, que acrescenta o sabão em pó e define o limite de cada produto; como o pré-projeto especificava creme dental branco, a lista final — tipo, cor, embalagem e forma de entrega — será validada com a PEM, a CCM e a CPIM antes de qualquer aquisição; (2) a rifa solidária como fonte complementar de recursos: a divulgação permanece de custo zero, e a receita da rifa, deduzido o prêmio, destina-se exclusivamente à compra de itens; (3) as ações de mobilização e junto à sociedade; (4) o sistema on-line de controle de vendas e prestação de contas; e (5) a reformulação do objetivo específico relativo ao "efeito rebote", que passa de comprovar para identificar o fenômeno, uma vez que sua comprovação exigiria levantamento de dados de custos públicos alheio ao escopo da ação extensionista. O quantitativo arrecadado será acompanhado semanalmente em relação à meta.</w:t>
+              <w:t>Ajustes em relação ao pré-projeto aprovado. Esta versão mantém a fundamentação, os objetivos e a meta de referência de mais de 8.000 itens do pré-projeto (Anexo 3) e incorpora: (1) a lista atualizada de itens, que acrescenta o sabão em pó e define o limite de cada produto; como o pré-projeto especificava creme dental branco, a lista final — tipo, cor, embalagem e forma de entrega — será validada com a PEM, a CCM e a CPIM antes de qualquer aquisição; (2) a rifa solidária como fonte complementar de recursos: a divulgação permanece de custo zero, e a receita da rifa, deduzido o prêmio, destina-se exclusivamente à compra de itens; (3) as ações de mobilização e junto à sociedade; (4) o sistema on-line de controle de vendas e prestação de contas; e (5) a reformulação dos objetivos específicos e o tratamento do "efeito rebote" como categoria de análise fundamentada na literatura, sem pretensão de comprovar a relação entre prevenção e custos públicos, o que exigiria levantamento de dados alheio ao escopo da ação extensionista. O quantitativo arrecadado será acompanhado semanalmente em relação à meta.</w:t>
+            </w:r>
+          </w:p>
+        </w:tc>
+      </w:tr>
+      <w:tr>
+        <w:tc>
+          <w:tcPr>
+            <w:tcW w:type="dxa" w:w="2381"/>
+          </w:tcPr>
+          <w:p>
+            <w:r>
+              <w:rPr>
+                <w:b/>
+                <w:i w:val="0"/>
+                <w:color w:val="444444"/>
+              </w:rPr>
+              <w:t>Referências</w:t>
+            </w:r>
+          </w:p>
+        </w:tc>
+        <w:tc>
+          <w:tcPr>
+            <w:tcW w:type="dxa" w:w="7824"/>
+          </w:tcPr>
+          <w:p>
+            <w:pPr>
+              <w:jc w:val="both"/>
+            </w:pPr>
+            <w:r>
+              <w:rPr>
+                <w:b w:val="0"/>
+                <w:i w:val="0"/>
+                <w:color w:val="444444"/>
+              </w:rPr>
+              <w:t>BRASIL. Constituição (1988). Constituição da República Federativa do Brasil. Brasília, DF: Presidência da República, 1988.</w:t>
+            </w:r>
+          </w:p>
+          <w:p>
+            <w:pPr>
+              <w:spacing w:before="80"/>
+              <w:jc w:val="both"/>
+            </w:pPr>
+            <w:r>
+              <w:rPr>
+                <w:b w:val="0"/>
+                <w:i w:val="0"/>
+                <w:color w:val="444444"/>
+              </w:rPr>
+              <w:t>BRASIL. Lei nº 7.210, de 11 de julho de 1984. Institui a Lei de Execução Penal. Brasília, DF: Presidência da República, 1984.</w:t>
+            </w:r>
+          </w:p>
+          <w:p>
+            <w:pPr>
+              <w:spacing w:before="80"/>
+              <w:jc w:val="both"/>
+            </w:pPr>
+            <w:r>
+              <w:rPr>
+                <w:b w:val="0"/>
+                <w:i w:val="0"/>
+                <w:color w:val="444444"/>
+              </w:rPr>
+              <w:t>BRASIL. Lei nº 13.005, de 25 de junho de 2014. Aprova o Plano Nacional de Educação - PNE e dá outras providências. Brasília, DF: Presidência da República, 2014.</w:t>
+            </w:r>
+          </w:p>
+          <w:p>
+            <w:pPr>
+              <w:spacing w:before="80"/>
+              <w:jc w:val="both"/>
+            </w:pPr>
+            <w:r>
+              <w:rPr>
+                <w:b w:val="0"/>
+                <w:i w:val="0"/>
+                <w:color w:val="444444"/>
+              </w:rPr>
+              <w:t>BRASIL. Ministério da Educação. Conselho Nacional de Educação. Câmara de Educação Superior. Resolução nº 7, de 18 de dezembro de 2018. Estabelece as Diretrizes para a Extensão na Educação Superior Brasileira. Brasília, DF: MEC, 2018.</w:t>
+            </w:r>
+          </w:p>
+          <w:p>
+            <w:pPr>
+              <w:spacing w:before="80"/>
+              <w:jc w:val="both"/>
+            </w:pPr>
+            <w:r>
+              <w:rPr>
+                <w:b w:val="0"/>
+                <w:i w:val="0"/>
+                <w:color w:val="444444"/>
+              </w:rPr>
+              <w:t>BRASIL. Supremo Tribunal Federal. Arguição de Descumprimento de Preceito Fundamental 347. Brasília, DF: STF, 2023.</w:t>
+            </w:r>
+          </w:p>
+          <w:p>
+            <w:pPr>
+              <w:spacing w:before="80"/>
+              <w:jc w:val="both"/>
+            </w:pPr>
+            <w:r>
+              <w:rPr>
+                <w:b w:val="0"/>
+                <w:i w:val="0"/>
+                <w:color w:val="444444"/>
+              </w:rPr>
+              <w:t>FERNANDES, Luiz Henrique et al. Necessidade de aprimoramento do atendimento à saúde no sistema carcerário. Revista de Saúde Pública, v. 48, n. 2, p. 275-283, 2014.</w:t>
+            </w:r>
+          </w:p>
+          <w:p>
+            <w:pPr>
+              <w:spacing w:before="80"/>
+              <w:jc w:val="both"/>
+            </w:pPr>
+            <w:r>
+              <w:rPr>
+                <w:b w:val="0"/>
+                <w:i w:val="0"/>
+                <w:color w:val="444444"/>
+              </w:rPr>
+              <w:t>GOIS, Swyanne Macêdo et al. Para além das grades e punições: uma revisão sistemática sobre a saúde penitenciária. Ciência &amp; Saúde Coletiva, v. 17, n. 5, p. 1235-1246, 2012.</w:t>
+            </w:r>
+          </w:p>
+          <w:p>
+            <w:pPr>
+              <w:spacing w:before="80"/>
+              <w:jc w:val="both"/>
+            </w:pPr>
+            <w:r>
+              <w:rPr>
+                <w:b w:val="0"/>
+                <w:i w:val="0"/>
+                <w:color w:val="444444"/>
+              </w:rPr>
+              <w:t>LÔBO, Nancy Meriane de Nóvoa et al. Análise do cuidado em saúde no sistema prisional do Pará, Brasil. Ciência &amp; Saúde Coletiva, v. 27, n. 12, 2022.</w:t>
+            </w:r>
+          </w:p>
+          <w:p>
+            <w:pPr>
+              <w:spacing w:before="80"/>
+              <w:jc w:val="both"/>
+            </w:pPr>
+            <w:r>
+              <w:rPr>
+                <w:b w:val="0"/>
+                <w:i w:val="0"/>
+                <w:color w:val="444444"/>
+              </w:rPr>
+              <w:t>MINAYO, Maria Cecília de Souza; RIBEIRO, Adalgisa Peixoto. Condições de saúde dos presos do estado do Rio de Janeiro, Brasil. Ciência &amp; Saúde Coletiva, v. 21, n. 7, p. 2031-2040, 2016.</w:t>
+            </w:r>
+          </w:p>
+          <w:p>
+            <w:pPr>
+              <w:spacing w:before="80"/>
+              <w:jc w:val="both"/>
+            </w:pPr>
+            <w:r>
+              <w:rPr>
+                <w:b w:val="0"/>
+                <w:i w:val="0"/>
+                <w:color w:val="444444"/>
+              </w:rPr>
+              <w:t>SÁ, Maria Cecília de et al. Saúde em prisões: representações e práticas dos agentes de segurança penitenciária no Rio de Janeiro, Brasil. Cadernos de Saúde Pública, v. 24, n. 8, 2008.</w:t>
             </w:r>
           </w:p>
         </w:tc>

</xml_diff>

<commit_message>
Justificativa com dados de Maringá (inspeções da Defensoria 2025), autoria corrigida (Diuana et al.) e referências ABNT
Co-Authored-By: Claude Opus 5.5 <noreply@anthropic.com>
Claude-Session: https://claude.ai/code/session_01MBn9YrntdXfTASAVKo9hpN
</commit_message>
<xml_diff>
--- a/entregas/projeto-escrito.docx
+++ b/entregas/projeto-escrito.docx
@@ -889,7 +889,7 @@
                 <w:i w:val="0"/>
                 <w:color w:val="444444"/>
               </w:rPr>
-              <w:t>O sistema carcerário brasileiro atravessa uma crise estrutural reconhecida pelo Supremo Tribunal Federal, no julgamento da ADPF 347, como um "estado de coisas inconstitucional". A Lei de Execução Penal (Lei nº 7.210/1984) assegura à pessoa presa assistência material e assistência à saúde de caráter preventivo e curativo (arts. 12, 14 e 41). A literatura científica, contudo, documenta escassez crônica de insumos básicos de higiene nas unidades prisionais, o que submete os custodiados a condições degradantes de habitação e convivência (SÁ et al., 2008; MINAYO; RIBEIRO, 2016; LÔBO et al., 2022). Diante dessa insuficiência, os familiares frequentemente assumem o custo dos itens de higiene e dos medicamentos de uso rotineiro (SÁ et al., 2008; MINAYO; RIBEIRO, 2016).</w:t>
+              <w:t>O sistema carcerário brasileiro atravessa uma crise estrutural reconhecida pelo Supremo Tribunal Federal, no julgamento da ADPF 347, como um "estado de coisas inconstitucional". A Lei de Execução Penal (Lei nº 7.210/1984) assegura à pessoa presa assistência material e assistência à saúde de caráter preventivo e curativo (arts. 12, 14 e 41). A literatura científica, contudo, documenta escassez crônica de insumos básicos de higiene nas unidades prisionais, o que submete os custodiados a condições degradantes de habitação e convivência (DIUANA et al., 2008; MINAYO; RIBEIRO, 2016; LÔBO et al., 2022). Diante dessa insuficiência, os familiares frequentemente assumem o custo dos itens de higiene e dos medicamentos de uso rotineiro (DIUANA et al., 2008; MINAYO; RIBEIRO, 2016).</w:t>
             </w:r>
           </w:p>
           <w:p>
@@ -903,7 +903,7 @@
                 <w:i w:val="0"/>
                 <w:color w:val="444444"/>
               </w:rPr>
-              <w:t>Os estudos indicam que a higiene precária mantém associação multifatorial com o adoecimento no cárcere, atuando em conjunto com a superlotação, a ventilação inadequada e a alimentação deficiente (GOIS et al., 2012; MINAYO; RIBEIRO, 2016). Em inquérito com 1.573 presos do Rio de Janeiro, Minayo e Ribeiro (2016) registraram elevada prevalência autorreferida de doenças de pele, com destaque para alergias e dermatites (43,4%). Quando o preso adoece, o Estado mobiliza atendimento interno, medicamentos, exames, agentes prisionais, escoltas e a rede externa do SUS; em unidades paulistas, a falta de escolta foi o problema mais citado nos encaminhamentos de saúde, relatado por 76,8% das penitenciárias masculinas (FERNANDES et al., 2014). Esses estudos, porém, não apresentam valores em reais nem comparam o custo da prevenção com o do tratamento; por isso, o projeto trata a relação entre prevenção e redução de custos como hipótese, e não como fato comprovado.</w:t>
+              <w:t>Os estudos indicam que a higiene precária mantém associação multifatorial com o adoecimento no cárcere, atuando em conjunto com a superlotação, a ventilação inadequada e a alimentação deficiente (GOIS et al., 2012; MINAYO; RIBEIRO, 2016). Em inquérito com 1.573 presos do Rio de Janeiro, Minayo e Ribeiro (2016) registraram elevada prevalência autorreferida de doenças de pele, com destaque para alergias e dermatites (43,4%). Quando o preso adoece, o Estado mobiliza atendimento interno, medicamentos, exames, agentes prisionais, escoltas e a rede externa do SUS; em unidades paulistas, a falta de escolta foi o problema mais citado nos encaminhamentos de saúde, relatado por 53 das 69 penitenciárias masculinas pesquisadas (FERNANDES et al., 2014). Esses estudos, porém, não apresentam valores em reais nem comparam o custo da prevenção com o do tratamento; por isso, o projeto trata a relação entre prevenção e redução de custos como hipótese, e não como fato comprovado.</w:t>
             </w:r>
           </w:p>
           <w:p>
@@ -918,6 +918,20 @@
                 <w:color w:val="444444"/>
               </w:rPr>
               <w:t>Nesse contexto, o projeto utiliza a expressão "efeito rebote" como categoria de análise para compreender o encadeamento de consequências decorrentes da insuficiência da assistência material: a ausência de itens básicos de higiene pode contribuir para o agravamento das condições sanitárias, gerando demandas posteriores de maior complexidade que retornam ao próprio Estado (atendimentos, deslocamentos e escoltas) e que alcançam também as famílias, sobre as quais recai parte dos custos, com prejuízo à manutenção dos vínculos durante o cumprimento da pena.</w:t>
+            </w:r>
+          </w:p>
+          <w:p>
+            <w:pPr>
+              <w:spacing w:before="80"/>
+              <w:jc w:val="both"/>
+            </w:pPr>
+            <w:r>
+              <w:rPr>
+                <w:b w:val="0"/>
+                <w:i w:val="0"/>
+                <w:color w:val="444444"/>
+              </w:rPr>
+              <w:t>A realidade de Maringá confirma a pertinência do recorte. Relatórios de inspeção da Defensoria Pública do Paraná registraram, em 2025, ocupação acima da capacidade nas três unidades: 1.198 presos para 960 vagas na CCM (março), 423 para 330 na CPIM e 523 para 360 na PEM (maio). Os mesmos relatórios apontam falta de creme dental e escova na CCM; falta de pasta de dente, aparelho de barbear e escova na PEM; e, na CPIM, que o kit de higiene não vinha sendo enviado completo, sendo os itens em falta supridos pelo Conselho da Comunidade (PARANÁ, 2025a; 2025b; 2025c). Trata-se de dados declarados pelas direções e referentes a um único dia de inspeção, mas que indicam, no próprio território do projeto, a carência dos itens que a campanha pretende arrecadar.</w:t>
             </w:r>
           </w:p>
           <w:p>
@@ -1606,6 +1620,20 @@
                 <w:i w:val="0"/>
                 <w:color w:val="444444"/>
               </w:rPr>
+              <w:t>DIUANA, Vilma et al. Saúde em prisões: representações e práticas dos agentes de segurança penitenciária no Rio de Janeiro, Brasil. Cadernos de Saúde Pública, v. 24, n. 8, p. 1887-1896, 2008.</w:t>
+            </w:r>
+          </w:p>
+          <w:p>
+            <w:pPr>
+              <w:spacing w:before="80"/>
+              <w:jc w:val="both"/>
+            </w:pPr>
+            <w:r>
+              <w:rPr>
+                <w:b w:val="0"/>
+                <w:i w:val="0"/>
+                <w:color w:val="444444"/>
+              </w:rPr>
               <w:t>FERNANDES, Luiz Henrique et al. Necessidade de aprimoramento do atendimento à saúde no sistema carcerário. Revista de Saúde Pública, v. 48, n. 2, p. 275-283, 2014.</w:t>
             </w:r>
           </w:p>
@@ -1662,7 +1690,35 @@
                 <w:i w:val="0"/>
                 <w:color w:val="444444"/>
               </w:rPr>
-              <w:t>SÁ, Maria Cecília de et al. Saúde em prisões: representações e práticas dos agentes de segurança penitenciária no Rio de Janeiro, Brasil. Cadernos de Saúde Pública, v. 24, n. 8, 2008.</w:t>
+              <w:t>PARANÁ. Defensoria Pública do Estado do Paraná. Núcleo da Política Criminal e da Execução Penal (NUPEP). Relatório de inspeção na Casa de Custódia de Maringá (CCM). Curitiba, 2025a. Disponível em: https://www.defensoriapublica.pr.def.br/sites/default/arquivos_restritos/files/documento/2025-03/relatorio_inspecao_ccm_1.pdf. Acesso em: 2 out. 2026.</w:t>
+            </w:r>
+          </w:p>
+          <w:p>
+            <w:pPr>
+              <w:spacing w:before="80"/>
+              <w:jc w:val="both"/>
+            </w:pPr>
+            <w:r>
+              <w:rPr>
+                <w:b w:val="0"/>
+                <w:i w:val="0"/>
+                <w:color w:val="444444"/>
+              </w:rPr>
+              <w:t>PARANÁ. Defensoria Pública do Estado do Paraná. Núcleo da Política Criminal e da Execução Penal (NUPEP). Relatório de inspeção na Colônia Penal Industrial de Maringá (CPIM). Curitiba, 2025b. Disponível em: https://www.defensoriapublica.pr.def.br/sites/default/arquivos_restritos/files/documento/2025-09/relatorio_inspecao_cpim_final.pdf. Acesso em: 2 out. 2026.</w:t>
+            </w:r>
+          </w:p>
+          <w:p>
+            <w:pPr>
+              <w:spacing w:before="80"/>
+              <w:jc w:val="both"/>
+            </w:pPr>
+            <w:r>
+              <w:rPr>
+                <w:b w:val="0"/>
+                <w:i w:val="0"/>
+                <w:color w:val="444444"/>
+              </w:rPr>
+              <w:t>PARANÁ. Defensoria Pública do Estado do Paraná. Núcleo da Política Criminal e da Execução Penal (NUPEP). Relatório de inspeção na Penitenciária Estadual de Maringá (PEM). Curitiba, 2025c. Disponível em: https://www.defensoriapublica.pr.def.br/sites/default/arquivos_restritos/files/documento/2025-10/relatorio_inspecao_pem.pdf. Acesso em: 2 out. 2026.</w:t>
             </w:r>
           </w:p>
         </w:tc>

</xml_diff>

<commit_message>
Justificativa com o texto da Francieli (extensão, reincidência, competências) e referências dela
Co-Authored-By: Claude Opus 5.5 <noreply@anthropic.com>
Claude-Session: https://claude.ai/code/session_01MBn9YrntdXfTASAVKo9hpN
</commit_message>
<xml_diff>
--- a/entregas/projeto-escrito.docx
+++ b/entregas/projeto-escrito.docx
@@ -875,7 +875,49 @@
                 <w:i w:val="0"/>
                 <w:color w:val="444444"/>
               </w:rPr>
-              <w:t>A extensão universitária integra, ao lado do ensino e da pesquisa, o tripé da educação superior brasileira: a Constituição Federal, em seu art. 207, estabelece a indissociabilidade entre ensino, pesquisa e extensão. A Resolução CNE/CES nº 7/2018, que regulamenta a Meta 12.7 do Plano Nacional de Educação (Lei nº 13.005/2014), determina que as atividades de extensão componham no mínimo 10% da carga horária curricular dos cursos de graduação e orienta que sejam dirigidas prioritariamente a áreas de grande pertinência social. No curso de Direito, essa vivência permite ao acadêmico compreender a aplicação prática das normas jurídicas e os efeitos que delas decorrem sobre a vida das pessoas.</w:t>
+              <w:t>A extensão universitária integra, ao lado do ensino e da pesquisa, o tripé que sustenta a educação superior brasileira. A Constituição Federal de 1988, em seu art. 207, estabelece que as universidades obedecerão ao princípio da indissociabilidade entre ensino, pesquisa e extensão (BRASIL, 1988), o que evidencia que a formação acadêmica não deve se restringir ao ambiente da sala de aula, mas alcançar também o contato com a realidade social. Nesse sentido, a Resolução CNE/CES nº 7, de 18 de dezembro de 2018, estabelece as Diretrizes para a Extensão na Educação Superior Brasileira, editada para regulamentar a Meta 12.7 do Plano Nacional de Educação então vigente (Lei nº 13.005/2014), determinando que as atividades de extensão componham, no mínimo, 10% do total da carga horária curricular dos cursos de graduação, devendo integrar a matriz curricular (BRASIL, 2014; BRASIL, 2018).</w:t>
+            </w:r>
+          </w:p>
+          <w:p>
+            <w:pPr>
+              <w:spacing w:before="80"/>
+              <w:jc w:val="both"/>
+            </w:pPr>
+            <w:r>
+              <w:rPr>
+                <w:b w:val="0"/>
+                <w:i w:val="0"/>
+                <w:color w:val="444444"/>
+              </w:rPr>
+              <w:t>Para além de uma exigência normativa, a extensão aproxima o estudante das demandas concretas da sociedade. As diretrizes nacionais orientam que tais ações sejam direcionadas, prioritariamente, a áreas de grande pertinência social (BRASIL, 2018), permitindo que o conhecimento produzido no ambiente universitário retorne à comunidade sob a forma de reflexão, orientação e proposição de soluções. No âmbito do curso de Direito, essa vivência revela-se especialmente relevante, uma vez que possibilita ao acadêmico compreender a aplicação prática das normas jurídicas e os efeitos que delas decorrem sobre a vida dos indivíduos.</w:t>
+            </w:r>
+          </w:p>
+          <w:p>
+            <w:pPr>
+              <w:spacing w:before="80"/>
+              <w:jc w:val="both"/>
+            </w:pPr>
+            <w:r>
+              <w:rPr>
+                <w:b w:val="0"/>
+                <w:i w:val="0"/>
+                <w:color w:val="444444"/>
+              </w:rPr>
+              <w:t>O projeto "Efeito Rebote: o custo da reincidência" insere-se nessa proposta ao abordar o sistema prisional brasileiro sob a perspectiva da reincidência criminal e de seus reflexos sociais e econômicos. Ao tratar desse tema, os acadêmicos são conduzidos a relacionar os conteúdos estudados em disciplinas como Direito Penal, Direito Processual Penal e Execução Penal a uma questão que repercute diretamente na segurança pública e na destinação dos recursos estatais. Dessa forma, o projeto busca contribuir para o desenvolvimento do senso crítico, da responsabilidade social e da capacidade de análise técnico-jurídica de seus participantes.</w:t>
+            </w:r>
+          </w:p>
+          <w:p>
+            <w:pPr>
+              <w:spacing w:before="80"/>
+              <w:jc w:val="both"/>
+            </w:pPr>
+            <w:r>
+              <w:rPr>
+                <w:b w:val="0"/>
+                <w:i w:val="0"/>
+                <w:color w:val="444444"/>
+              </w:rPr>
+              <w:t>Além do aprendizado teórico, a experiência extensionista favorece o desenvolvimento de competências práticas, tais como o trabalho em equipe, a organização de atividades, a comunicação com o público e a gestão de recursos, habilidades igualmente exigidas no exercício profissional. Assim, o projeto de extensão cumpre dupla função: contribui para a formação de acadêmicos mais preparados para a atuação jurídica e reafirma o compromisso da instituição de ensino superior com a transformação da realidade social.</w:t>
             </w:r>
           </w:p>
           <w:p>
@@ -945,7 +987,7 @@
                 <w:i w:val="0"/>
                 <w:color w:val="444444"/>
               </w:rPr>
-              <w:t>A intervenção proposta não pretende solucionar o problema estrutural da assistência material no sistema prisional nem substituir a responsabilidade estatal pela garantia desses direitos. A arrecadação e a entrega de materiais de higiene constituem uma intervenção pontual, voltada à mitigação de uma das consequências concretas dessa insuficiência, que permite aos acadêmicos observar na prática os efeitos sociais e institucionais do problema estudado e relacioná-los aos conteúdos de Direito Penal, Direito Processual Penal e Execução Penal.</w:t>
+              <w:t>A intervenção proposta não pretende solucionar o problema estrutural da assistência material no sistema prisional nem substituir a responsabilidade estatal pela garantia desses direitos. A arrecadação e a entrega de materiais de higiene constituem uma intervenção pontual, voltada à mitigação de uma das consequências concretas dessa insuficiência, que permite aos acadêmicos observar na prática os efeitos sociais e institucionais do problema estudado.</w:t>
             </w:r>
           </w:p>
         </w:tc>
@@ -1550,7 +1592,7 @@
                 <w:i w:val="0"/>
                 <w:color w:val="444444"/>
               </w:rPr>
-              <w:t>BRASIL. Constituição (1988). Constituição da República Federativa do Brasil. Brasília, DF: Presidência da República, 1988.</w:t>
+              <w:t>BRASIL. [Constituição (1988)]. Constituição da República Federativa do Brasil de 1988. Brasília, DF: Presidência da República, 1988.</w:t>
             </w:r>
           </w:p>
           <w:p>
@@ -1578,7 +1620,7 @@
                 <w:i w:val="0"/>
                 <w:color w:val="444444"/>
               </w:rPr>
-              <w:t>BRASIL. Lei nº 13.005, de 25 de junho de 2014. Aprova o Plano Nacional de Educação - PNE e dá outras providências. Brasília, DF: Presidência da República, 2014.</w:t>
+              <w:t>BRASIL. Lei nº 13.005, de 25 de junho de 2014. Aprova o Plano Nacional de Educação – PNE e dá outras providências. Brasília, DF: Presidência da República, 2014.</w:t>
             </w:r>
           </w:p>
           <w:p>
@@ -1592,7 +1634,7 @@
                 <w:i w:val="0"/>
                 <w:color w:val="444444"/>
               </w:rPr>
-              <w:t>BRASIL. Ministério da Educação. Conselho Nacional de Educação. Câmara de Educação Superior. Resolução nº 7, de 18 de dezembro de 2018. Estabelece as Diretrizes para a Extensão na Educação Superior Brasileira. Brasília, DF: MEC, 2018.</w:t>
+              <w:t>BRASIL. Ministério da Educação. Conselho Nacional de Educação. Câmara de Educação Superior. Resolução nº 7, de 18 de dezembro de 2018. Estabelece as Diretrizes para a Extensão na Educação Superior Brasileira e regimenta o disposto na Meta 12.7 da Lei nº 13.005/2014. Brasília, DF: MEC, 2018.</w:t>
             </w:r>
           </w:p>
           <w:p>

</xml_diff>

<commit_message>
Objetivos ajustados (sugestões aceitas pela turma) e roda de conversa com familiares no projeto e no cronograma
- check.sh: PDF dividido só em '. ' para não quebrar pendências com ';'

Co-Authored-By: Claude Opus 5.5 <noreply@anthropic.com>
Claude-Session: https://claude.ai/code/session_01MBn9YrntdXfTASAVKo9hpN
</commit_message>
<xml_diff>
--- a/entregas/projeto-escrito.docx
+++ b/entregas/projeto-escrito.docx
@@ -1036,7 +1036,7 @@
                 <w:i w:val="0"/>
                 <w:color w:val="444444"/>
               </w:rPr>
-              <w:t>Objetivos específicos: (1) avaliar condições que coloquem apenados em situação de risco; (2) promover o acolhimento às famílias daqueles em reclusão; (3) realizar busca e arrecadação de insumos conforme a necessidade das instituições PEM, CCM e CPIM; (4) promover campanhas de doação para as instituições PEM, CCM e CPIM; (5) estimular nos acadêmicos de Direito o pensamento crítico, humanístico e de cidadania; e (6) promover na sociedade em geral a responsabilidade social.</w:t>
+              <w:t>Objetivos específicos: (1) identificar a ocorrência do fenômeno "efeito rebote" como problema social; (2) observar, nas visitas técnicas, as condições de assistência material nas unidades; (3) promover o acolhimento às famílias daqueles em reclusão, por meio de roda de conversa; (4) realizar busca, arrecadação e campanhas de doação de insumos conforme a necessidade da PEM, da CCM e da CPIM; (5) estimular nos acadêmicos de Direito o pensamento crítico, humanístico e de cidadania; e (6) promover a responsabilidade social na comunidade por meio das redes sociais e das ações de mobilização.</w:t>
             </w:r>
           </w:p>
         </w:tc>
@@ -1515,6 +1515,20 @@
                 <w:i w:val="0"/>
                 <w:color w:val="444444"/>
               </w:rPr>
+              <w:t>Acolhimento às famílias. Será realizada uma roda de conversa com familiares de pessoas privadas de liberdade, conduzida pelos acadêmicos sob mediação da professora responsável, em [PENDENTE: data e local; sugestão: dependências da UniCesumar], com divulgação feita em parceria com [PENDENTE: instituição que fará a ponte com as famílias, como o Conselho da Comunidade ou a Defensoria Pública] e mediante autorização das instâncias envolvidas. O encontro terá caráter de escuta e acolhimento e abordará, em linguagem acessível, os direitos da pessoa presa e de seus familiares (assistência material e à saúde, regras de visita) e os canais públicos de apoio. Regras: participação voluntária; sigilo sobre os relatos; nenhum registro de imagem ou dado que identifique os participantes, sendo a presença registrada apenas em número; e vedação de orientação jurídica individual pelos acadêmicos, com encaminhamento dos casos concretos à Defensoria Pública.</w:t>
+            </w:r>
+          </w:p>
+          <w:p>
+            <w:pPr>
+              <w:spacing w:before="80"/>
+              <w:jc w:val="both"/>
+            </w:pPr>
+            <w:r>
+              <w:rPr>
+                <w:b w:val="0"/>
+                <w:i w:val="0"/>
+                <w:color w:val="444444"/>
+              </w:rPr>
               <w:t>Proteção de dados. O nome e o telefone dos compradores são coletados exclusivamente para identificação dos bilhetes e contato com o ganhador, ficam acessíveis apenas ao vendedor e à comissão financeira, não são divulgados e serão eliminados após a entrega do prêmio, em observância à Lei Geral de Proteção de Dados (Lei nº 13.709/2018).</w:t>
             </w:r>
           </w:p>
@@ -1557,7 +1571,7 @@
                 <w:i w:val="0"/>
                 <w:color w:val="444444"/>
               </w:rPr>
-              <w:t>Ajustes em relação ao pré-projeto aprovado. Esta versão mantém a fundamentação, os objetivos e a meta de referência de mais de 8.000 itens do pré-projeto (Anexo 3) e incorpora: (1) a lista atualizada de itens, que acrescenta o sabão em pó e define o limite de cada produto; como o pré-projeto especificava creme dental branco, a lista final — tipo, cor, embalagem e forma de entrega — será validada com a PEM, a CCM e a CPIM antes de qualquer aquisição; (2) a rifa solidária como fonte complementar de recursos: a divulgação permanece de custo zero, e a receita da rifa, deduzido o prêmio, destina-se exclusivamente à compra de itens; (3) as ações de mobilização e junto à sociedade; (4) o sistema on-line de controle de vendas e prestação de contas; e (5) a reformulação dos objetivos específicos e o tratamento do "efeito rebote" como categoria de análise fundamentada na literatura, sem pretensão de comprovar a relação entre prevenção e custos públicos, o que exigiria levantamento de dados alheio ao escopo da ação extensionista. O quantitativo arrecadado será acompanhado semanalmente em relação à meta.</w:t>
+              <w:t>Ajustes em relação ao pré-projeto aprovado. Esta versão mantém a fundamentação, os objetivos e a meta de referência de mais de 8.000 itens do pré-projeto (Anexo 3) e incorpora: (1) a lista atualizada de itens, que acrescenta o sabão em pó e define o limite de cada produto; como o pré-projeto especificava creme dental branco, a lista final — tipo, cor, embalagem e forma de entrega — será validada com a PEM, a CCM e a CPIM antes de qualquer aquisição; (2) a rifa solidária como fonte complementar de recursos: a divulgação permanece de custo zero, e a receita da rifa, deduzido o prêmio, destina-se exclusivamente à compra de itens; (3) as ações de mobilização e junto à sociedade, incluindo a roda de conversa com familiares; (4) o sistema on-line de controle de vendas e prestação de contas; e (5) a reformulação dos objetivos específicos e o tratamento do "efeito rebote" como categoria de análise fundamentada na literatura, sem pretensão de comprovar a relação entre prevenção e custos públicos, o que exigiria levantamento de dados alheio ao escopo da ação extensionista. O quantitativo arrecadado será acompanhado semanalmente em relação à meta.</w:t>
             </w:r>
           </w:p>
         </w:tc>
@@ -2624,7 +2638,7 @@
                 <w:i w:val="0"/>
                 <w:color w:val="444444"/>
               </w:rPr>
-              <w:t>Pesquisa de dados (SENAPPEN, CNJ, Defensoria Pública do Paraná); produção de carrosséis e vídeos curtos; organização do calendário de três publicações semanais e envio prévio para aprovação.</w:t>
+              <w:t>Pesquisa de dados (SENAPPEN, CNJ, Defensoria Pública do Paraná); produção de carrosséis e vídeos curtos; organização do calendário de três publicações semanais e envio prévio para aprovação; elaboração do roteiro da roda de conversa com familiares e contato com a instituição parceira para a divulgação.</w:t>
             </w:r>
           </w:p>
           <w:p>
@@ -2835,7 +2849,7 @@
                 <w:i w:val="0"/>
                 <w:color w:val="444444"/>
               </w:rPr>
-              <w:t>ENCONTRO 8 – Triagem e Conferência dos Itens</w:t>
+              <w:t>ENCONTRO 8 – Triagem, Conferência e Consolidação dos Itens</w:t>
             </w:r>
           </w:p>
           <w:p>
@@ -2877,7 +2891,7 @@
                 <w:i w:val="0"/>
                 <w:color w:val="444444"/>
               </w:rPr>
-              <w:t>Assegurar que os itens arrecadados atendam às especificações exigidas pelas unidades prisionais.</w:t>
+              <w:t>Assegurar que os itens atendam às especificações das unidades e consolidar o quantitativo arrecadado.</w:t>
             </w:r>
           </w:p>
           <w:p>
@@ -2898,7 +2912,7 @@
                 <w:i w:val="0"/>
                 <w:color w:val="444444"/>
               </w:rPr>
-              <w:t>Conferência item a item (tipo, peso, volume e embalagem); separação dos itens fora do padrão para destinação a outras instituições; contabilização parcial por tipo de item.</w:t>
+              <w:t>Conferência item a item (tipo, peso, volume e embalagem); separação dos itens fora do padrão para destinação a outras instituições; contagem por tipo de item; separação dos lotes por unidade (PEM, CCM e CPIM), conforme a orientação das unidades; atualização do relatório de transparência.</w:t>
             </w:r>
           </w:p>
           <w:p>
@@ -2919,7 +2933,7 @@
                 <w:i w:val="0"/>
                 <w:color w:val="444444"/>
               </w:rPr>
-              <w:t>Registro da triagem realizada pela equipe.</w:t>
+              <w:t>Registro da triagem e da consolidação realizadas pela equipe.</w:t>
             </w:r>
           </w:p>
           <w:p/>
@@ -3109,7 +3123,7 @@
                 <w:i w:val="0"/>
                 <w:color w:val="444444"/>
               </w:rPr>
-              <w:t>ENCONTRO 10 – Consolidação da Arrecadação</w:t>
+              <w:t>ENCONTRO 10 – Roda de Conversa com Familiares</w:t>
             </w:r>
           </w:p>
           <w:p>
@@ -3151,7 +3165,7 @@
                 <w:i w:val="0"/>
                 <w:color w:val="444444"/>
               </w:rPr>
-              <w:t>Consolidar o quantitativo total arrecadado e organizar os itens para a entrega.</w:t>
+              <w:t>Acolher familiares de pessoas privadas de liberdade e compartilhar informações sobre direitos e canais públicos de apoio.</w:t>
             </w:r>
           </w:p>
           <w:p>
@@ -3172,7 +3186,7 @@
                 <w:i w:val="0"/>
                 <w:color w:val="444444"/>
               </w:rPr>
-              <w:t>Contagem final por tipo de item; separação dos lotes por unidade (PEM, CCM e CPIM), conforme a orientação das unidades; atualização do relatório de transparência.</w:t>
+              <w:t>Recepção e escuta dos familiares; apresentação, em linguagem acessível, dos direitos relativos à assistência material, à saúde e às visitas; indicação dos canais de apoio (Defensoria Pública, Conselho da Comunidade); registro apenas do número de participantes, sem identificação.</w:t>
             </w:r>
           </w:p>
           <w:p>
@@ -3193,7 +3207,7 @@
                 <w:i w:val="0"/>
                 <w:color w:val="444444"/>
               </w:rPr>
-              <w:t>Relatório descritivo da etapa de consolidação.</w:t>
+              <w:t>Relatório reflexivo sobre a escuta das famílias e a relação com o efeito rebote.</w:t>
             </w:r>
           </w:p>
           <w:p/>

</xml_diff>

<commit_message>
Substitui "rifa" por "ação de arrecadação" em todos os documentos, bilhetes, planilha e app
Co-Authored-By: Claude Opus 5.5 <noreply@anthropic.com>
Claude-Session: https://claude.ai/code/session_01MBn9YrntdXfTASAVKo9hpN
</commit_message>
<xml_diff>
--- a/entregas/projeto-escrito.docx
+++ b/entregas/projeto-escrito.docx
@@ -1389,7 +1389,7 @@
                 <w:i w:val="0"/>
                 <w:color w:val="444444"/>
               </w:rPr>
-              <w:t>Os encontros ocorrem semanalmente, às segundas-feiras, às 18h15, com acompanhamento da professora responsável e registro de frequência, totalizando 15 encontros: o 1º e o 2º destinam-se à construção do projeto; do 3º ao 13º, ao desenvolvimento das atividades conforme os encaminhamentos da turma; o 14º, às visitas técnicas; e o 15º, à discussão dos resultados e à elaboração do relatório final. O conteúdo de cada encontro está detalhado no cronograma. Algumas ações ocorrem fora do horário dos encontros, em datas próprias: o encerramento das vendas da rifa (30/10), a publicação da lista de números (01/11), o sorteio transmitido ao vivo (02/11) e as visitas técnicas (04 e 05/11); os encontros correspondentes preparam e avaliam essas ações.</w:t>
+              <w:t>Os encontros ocorrem semanalmente, às segundas-feiras, às 18h15, com acompanhamento da professora responsável e registro de frequência, totalizando 15 encontros: o 1º e o 2º destinam-se à construção do projeto; do 3º ao 13º, ao desenvolvimento das atividades conforme os encaminhamentos da turma; o 14º, às visitas técnicas; e o 15º, à discussão dos resultados e à elaboração do relatório final. O conteúdo de cada encontro está detalhado no cronograma. Algumas ações ocorrem fora do horário dos encontros, em datas próprias: o encerramento das vendas da ação de arrecadação (30/10), a publicação da lista de números (01/11), o sorteio transmitido ao vivo (02/11) e as visitas técnicas (04 e 05/11); os encontros correspondentes preparam e avaliam essas ações.</w:t>
             </w:r>
           </w:p>
           <w:p>
@@ -1403,7 +1403,7 @@
                 <w:i w:val="0"/>
                 <w:color w:val="444444"/>
               </w:rPr>
-              <w:t>A metodologia fundamenta-se na Aprendizagem Baseada em Projetos (PjBL), organizada em seis etapas integradas: (1) imersão e identificação do problema, com estudo da realidade prisional de Maringá; (2) seleção e delimitação do problema prioritário: a insuficiência de itens de higiene e o "efeito rebote"; (3) análise do problema e levantamento das necessidades de aprendizagem; (4) estudo e investigação, com aprofundamento teórico e normativo; (5) planejamento e execução da intervenção: campanha de conscientização, arrecadação, rifa solidária e visitas técnicas com entrega dos itens; e (6) sistematização dos resultados, reflexão e elaboração do relatório final. Os estudantes organizam-se em quatro equipes (Apresentação e Visitas, Criação e Audiovisual, Pesquisa e Escrita, e Logística e Arrecadação), e todo o conteúdo produzido é encaminhado à professora responsável para análise e aprovação antes da execução ou publicação.</w:t>
+              <w:t>A metodologia fundamenta-se na Aprendizagem Baseada em Projetos (PjBL), organizada em seis etapas integradas: (1) imersão e identificação do problema, com estudo da realidade prisional de Maringá; (2) seleção e delimitação do problema prioritário: a insuficiência de itens de higiene e o "efeito rebote"; (3) análise do problema e levantamento das necessidades de aprendizagem; (4) estudo e investigação, com aprofundamento teórico e normativo; (5) planejamento e execução da intervenção: campanha de conscientização, doação de itens, ação de arrecadação solidária e visitas técnicas com entrega dos itens; e (6) sistematização dos resultados, reflexão e elaboração do relatório final. Os estudantes organizam-se em quatro equipes (Apresentação e Visitas, Criação e Audiovisual, Pesquisa e Escrita, e Logística e Arrecadação), e todo o conteúdo produzido é encaminhado à professora responsável para análise e aprovação antes da execução ou publicação.</w:t>
             </w:r>
           </w:p>
           <w:p>
@@ -1445,7 +1445,7 @@
                 <w:i w:val="0"/>
                 <w:color w:val="444444"/>
               </w:rPr>
-              <w:t>Ações junto à sociedade. Para que o projeto alcance a comunidade externa e não apenas o ambiente acadêmico, a rifa funcionará também como instrumento de conscientização, pois cada bilhete leva o perfil @efeitorebote.oficial e um QR Code de acesso ao conteúdo informativo do projeto, e os acadêmicos atuarão como multiplicadores, explicando o projeto a familiares, amigos e colegas de trabalho no momento da venda. A instituição parceira é a UniCesumar, que, mediante autorização, poderá ceder os espaços do campus para os pontos de coleta, o local de armazenamento, o transporte institucional e a cota de impressão. Outras instituições da comunidade de Maringá, como igrejas, delegacias e estabelecimentos comerciais, poderão receber pontos de coleta externos e material informativo sobre o "efeito rebote", mediante aprovação da professora responsável e autorização do responsável pelo local, seguindo as mesmas regras de identificação, recolhimento, triagem e registro dos pontos do campus.</w:t>
+              <w:t>Ações junto à sociedade. Para que o projeto alcance a comunidade externa e não apenas o ambiente acadêmico, a ação de arrecadação funcionará também como instrumento de conscientização, pois cada bilhete leva o perfil @efeitorebote.oficial e um QR Code de acesso ao conteúdo informativo do projeto, e os acadêmicos atuarão como multiplicadores, explicando o projeto a familiares, amigos e colegas de trabalho no momento da venda. A instituição parceira é a UniCesumar, que, mediante autorização, poderá ceder os espaços do campus para os pontos de coleta, o local de armazenamento, o transporte institucional e a cota de impressão. Outras instituições da comunidade de Maringá, como igrejas, delegacias e estabelecimentos comerciais, poderão receber pontos de coleta externos e material informativo sobre o "efeito rebote", mediante aprovação da professora responsável e autorização do responsável pelo local, seguindo as mesmas regras de identificação, recolhimento, triagem e registro dos pontos do campus.</w:t>
             </w:r>
           </w:p>
           <w:p>
@@ -1473,7 +1473,7 @@
                 <w:i w:val="0"/>
                 <w:color w:val="444444"/>
               </w:rPr>
-              <w:t>Rifa solidária. Como forma complementar de arrecadação, será realizada uma rifa com bilhetes numerados de 0001 a 2400, ao valor de R$ 5,00 cada. Cada acadêmico receberá um bloco de 30 bilhetes numerados em sequência, vendidos em sua rede de contatos, o que distribui a responsabilidade de forma igualitária e dispensa a organização de eventos. Para que a rifa também cumpra função de conscientização, cada bilhete trará o perfil do projeto no Instagram (@efeitorebote.oficial) e um QR Code de acesso a ele, de modo que o comprador, ao guardar o bilhete, tenha acesso ao conteúdo informativo do projeto. Como cada acadêmico vende de forma independente, o controle é centralizado no sistema on-line de vendas desenvolvido pela turma (aplicativo web acessado pelo celular com o e-mail cadastrado do acadêmico): a cada venda, o vendedor preenche o canhoto e registra no sistema, no mesmo dia, os números vendidos, o nome e o telefone do comprador e a forma de pagamento; o sistema só permite registrar números do bloco do próprio acadêmico, impede que um número seja vendido duas vezes e constitui o registro oficial da rifa. Para pagamentos por PIX, o sistema gera o código com o valor exato e a identificação do pedido, e o pagamento cai diretamente na conta de recebimento da comissão financeira (conta de uso exclusivo da rifa, indicada pela comissão e aprovada pela professora responsável), de modo que o dinheiro não fique com o vendedor; valores em espécie são entregues à comissão nos acertos semanais, realizados às segundas-feiras nos encontros, quando o registro é conferido com os extratos. Somente participam do sorteio os bilhetes registrados e pagos até 30/10/2026, às 23h59; a lista dos números participantes, sem dados pessoais, é publicada no perfil do projeto em 01/11/2026. O prêmio será um tablet Samsung Galaxy Tab A11+ (11 polegadas, Wi-Fi) ou modelo equivalente. O sorteio ocorrerá em 02/11/2026, às [PENDENTE: horário], com transmissão ao vivo no @efeitorebote.oficial: os números da lista oficial são impressos, dobrados e depositados em urna, e um número é retirado na presença da professora responsável e de duas testemunhas, com lavratura de ata; por ser transmitido on-line, o sorteio independe do funcionamento do campus. Para que a compra dos itens ocorra entre o fim das vendas (30/10) e a entrega (04/11), a lista validada pelas unidades e as cotações serão preparadas antes do fim das vendas. O prêmio será adquirido somente quando a arrecadação cobrir seu custo com margem; se as vendas forem insuficientes, a comissão financeira e a professora responsável buscarão doação ou desconto do prêmio; não sendo possível, a rifa será cancelada e os valores devolvidos integralmente aos compradores, conforme o Anexo 1. Os valores arrecadados, deduzido o custo de aquisição do prêmio, serão destinados exclusivamente à compra dos itens listados, com comprovação por nota fiscal e prestação de contas à professora responsável e à turma. A realização da rifa está condicionada à autorização da instituição e da professora responsável, observadas as normas institucionais e a legislação federal sobre distribuição de prêmios mediante sorteio (BRASIL, 1944; BRASIL, 1971); sem essa autorização, a rifa não será iniciada e a arrecadação seguirá apenas por doações diretas; o regulamento completo consta do Anexo 1.</w:t>
+              <w:t>Ação de arrecadação solidária. Como forma complementar de obtenção de recursos, será realizada uma ação de arrecadação com bilhetes numerados de 0001 a 2400, ao valor de R$ 5,00 cada. Cada acadêmico receberá um bloco de 30 bilhetes numerados em sequência, vendidos em sua rede de contatos, o que distribui a responsabilidade de forma igualitária e dispensa a organização de eventos. Para que a ação de arrecadação também cumpra função de conscientização, cada bilhete trará o perfil do projeto no Instagram (@efeitorebote.oficial) e um QR Code de acesso a ele, de modo que o comprador, ao guardar o bilhete, tenha acesso ao conteúdo informativo do projeto. Como cada acadêmico vende de forma independente, o controle é centralizado no sistema on-line de vendas desenvolvido pela turma (aplicativo web acessado pelo celular com o e-mail cadastrado do acadêmico): a cada venda, o vendedor preenche o canhoto e registra no sistema, no mesmo dia, os números vendidos, o nome e o telefone do comprador e a forma de pagamento; o sistema só permite registrar números do bloco do próprio acadêmico, impede que um número seja vendido duas vezes e constitui o registro oficial da ação de arrecadação. Para pagamentos por PIX, o sistema gera o código com o valor exato e a identificação do pedido, e o pagamento cai diretamente na conta de recebimento da comissão financeira (conta de uso exclusivo da ação de arrecadação, indicada pela comissão e aprovada pela professora responsável), de modo que o dinheiro não fique com o vendedor; valores em espécie são entregues à comissão nos acertos semanais, realizados às segundas-feiras nos encontros, quando o registro é conferido com os extratos. Somente participam do sorteio os bilhetes registrados e pagos até 30/10/2026, às 23h59; a lista dos números participantes, sem dados pessoais, é publicada no perfil do projeto em 01/11/2026. O prêmio será um tablet Samsung Galaxy Tab A11+ (11 polegadas, Wi-Fi) ou modelo equivalente. O sorteio ocorrerá em 02/11/2026, às [PENDENTE: horário], com transmissão ao vivo no @efeitorebote.oficial: os números da lista oficial são impressos, dobrados e depositados em urna, e um número é retirado na presença da professora responsável e de duas testemunhas, com lavratura de ata; por ser transmitido on-line, o sorteio independe do funcionamento do campus. Para que a compra dos itens ocorra entre o fim das vendas (30/10) e a entrega (04/11), a lista validada pelas unidades e as cotações serão preparadas antes do fim das vendas. O prêmio será adquirido somente quando a arrecadação cobrir seu custo com margem; se as vendas forem insuficientes, a comissão financeira e a professora responsável buscarão doação ou desconto do prêmio; não sendo possível, a ação de arrecadação será cancelada e os valores devolvidos integralmente aos compradores, conforme o Anexo 1. Os valores arrecadados, deduzido o custo de aquisição do prêmio, serão destinados exclusivamente à compra dos itens listados, com comprovação por nota fiscal e prestação de contas à professora responsável e à turma. A realização da ação de arrecadação está condicionada à autorização da instituição e da professora responsável, observadas as normas institucionais e a legislação federal sobre distribuição de prêmios mediante sorteio (BRASIL, 1944; BRASIL, 1971); sem essa autorização, a ação de arrecadação não será iniciada e a arrecadação seguirá apenas por doações diretas; o regulamento completo consta do Anexo 1.</w:t>
             </w:r>
           </w:p>
           <w:p>
@@ -1557,7 +1557,7 @@
                 <w:i w:val="0"/>
                 <w:color w:val="444444"/>
               </w:rPr>
-              <w:t>Prestação de contas e frequência. A comissão financeira confirma cada pagamento no sistema após conferir o extrato ou receber o valor em espécie; cada confirmação gera automaticamente o lançamento correspondente em livro-caixa que não admite edição nem exclusão (correções apenas por estorno), e toda despesa exige número e imagem da nota fiscal. O sistema verifica continuamente se as entradas correspondem aos bilhetes confirmados e se o saldo confere, e uma página pública de transparência, divulgada no perfil do projeto, apresenta os números participantes e os valores arrecadados e gastos, sem dados pessoais, levando à sociedade o acompanhamento da ação. Ao final, será elaborado relatório de transparência com o quantitativo arrecadado e entregue por tipo de item e por unidade, o valor obtido com a rifa e os comprovantes de compra. A frequência dos acadêmicos é registrada em cada encontro, e as entregas individuais descritas no cronograma compõem o relatório final do projeto.</w:t>
+              <w:t>Prestação de contas e frequência. A comissão financeira confirma cada pagamento no sistema após conferir o extrato ou receber o valor em espécie; cada confirmação gera automaticamente o lançamento correspondente em livro-caixa que não admite edição nem exclusão (correções apenas por estorno), e toda despesa exige número e imagem da nota fiscal. O sistema verifica continuamente se as entradas correspondem aos bilhetes confirmados e se o saldo confere, e uma página pública de transparência, divulgada no perfil do projeto, apresenta os números participantes e os valores arrecadados e gastos, sem dados pessoais, levando à sociedade o acompanhamento da ação. Ao final, será elaborado relatório de transparência com o quantitativo arrecadado e entregue por tipo de item e por unidade, o valor obtido com a ação de arrecadação e os comprovantes de compra. A frequência dos acadêmicos é registrada em cada encontro, e as entregas individuais descritas no cronograma compõem o relatório final do projeto.</w:t>
             </w:r>
           </w:p>
           <w:p>
@@ -1571,7 +1571,7 @@
                 <w:i w:val="0"/>
                 <w:color w:val="444444"/>
               </w:rPr>
-              <w:t>Ajustes em relação ao pré-projeto aprovado. Esta versão mantém a fundamentação, os objetivos e a meta de referência de mais de 8.000 itens do pré-projeto (Anexo 3) e incorpora: (1) a lista atualizada de itens, que acrescenta o sabão em pó e define o limite de cada produto; como o pré-projeto especificava creme dental branco, a lista final (tipo, cor, embalagem e forma de entrega) será validada com a PEM, a CCM e a CPIM antes de qualquer aquisição; (2) a rifa solidária como fonte complementar de recursos: a divulgação permanece de custo zero, e a receita da rifa, deduzido o prêmio, destina-se exclusivamente à compra de itens; (3) as ações de mobilização e junto à sociedade, incluindo a roda de conversa com familiares; (4) o sistema on-line de controle de vendas e prestação de contas; e (5) a reformulação dos objetivos específicos e o tratamento do "efeito rebote" como categoria de análise fundamentada na literatura, sem pretensão de comprovar a relação entre prevenção e custos públicos, o que exigiria levantamento de dados alheio ao escopo da ação extensionista. O quantitativo arrecadado será acompanhado semanalmente em relação à meta, que depende principalmente das doações diretas; a receita da rifa, deduzido o prêmio, tem caráter complementar.</w:t>
+              <w:t>Ajustes em relação ao pré-projeto aprovado. Esta versão mantém a fundamentação, os objetivos e a meta de referência de mais de 8.000 itens do pré-projeto (Anexo 3) e incorpora: (1) a lista atualizada de itens, que acrescenta o sabão em pó e define o limite de cada produto; como o pré-projeto especificava creme dental branco, a lista final (tipo, cor, embalagem e forma de entrega) será validada com a PEM, a CCM e a CPIM antes de qualquer aquisição; (2) a ação de arrecadação solidária como fonte complementar de recursos: a divulgação permanece de custo zero, e a receita da ação de arrecadação, deduzido o prêmio, destina-se exclusivamente à compra de itens; (3) as ações de mobilização e junto à sociedade, incluindo a roda de conversa com familiares; (4) o sistema on-line de controle de vendas e prestação de contas; e (5) a reformulação dos objetivos específicos e o tratamento do "efeito rebote" como categoria de análise fundamentada na literatura, sem pretensão de comprovar a relação entre prevenção e custos públicos, o que exigiria levantamento de dados alheio ao escopo da ação extensionista. O quantitativo arrecadado será acompanhado semanalmente em relação à meta, que depende principalmente das doações diretas; a receita da ação de arrecadação, deduzido o prêmio, tem caráter complementar.</w:t>
             </w:r>
           </w:p>
         </w:tc>
@@ -2146,7 +2146,7 @@
                 <w:i w:val="0"/>
                 <w:color w:val="444444"/>
               </w:rPr>
-              <w:t>Adaptação do projeto ao modelo institucional; definição dos itens aceitos e de suas especificações; deliberação sobre a rifa solidária e as regras de execução; elaboração do material de apresentação para as redes sociais e envio para aprovação.</w:t>
+              <w:t>Adaptação do projeto ao modelo institucional; definição dos itens aceitos e de suas especificações; deliberação sobre a ação de arrecadação solidária e as regras de execução; elaboração do material de apresentação para as redes sociais e envio para aprovação.</w:t>
             </w:r>
           </w:p>
           <w:p>
@@ -2357,7 +2357,7 @@
                 <w:i w:val="0"/>
                 <w:color w:val="444444"/>
               </w:rPr>
-              <w:t>ENCONTRO 4 – Lançamento da Campanha e Distribuição da Rifa</w:t>
+              <w:t>ENCONTRO 4 – Lançamento da Campanha e Distribuição dos Bilhetes</w:t>
             </w:r>
           </w:p>
           <w:p>
@@ -2399,7 +2399,7 @@
                 <w:i w:val="0"/>
                 <w:color w:val="444444"/>
               </w:rPr>
-              <w:t>Iniciar a campanha de conscientização e organizar a rifa solidária, mediante as aprovações necessárias.</w:t>
+              <w:t>Iniciar a campanha de conscientização e organizar a ação de arrecadação solidária, mediante as aprovações necessárias.</w:t>
             </w:r>
           </w:p>
           <w:p>
@@ -2810,7 +2810,7 @@
                 <w:i w:val="0"/>
                 <w:color w:val="444444"/>
               </w:rPr>
-              <w:t>Dar visibilidade à campanha no campus e monitorar o andamento da arrecadação e da rifa.</w:t>
+              <w:t>Dar visibilidade à campanha no campus e monitorar o andamento da doação de itens e da ação de arrecadação.</w:t>
             </w:r>
           </w:p>
           <w:p>
@@ -2831,7 +2831,7 @@
                 <w:i w:val="0"/>
                 <w:color w:val="444444"/>
               </w:rPr>
-              <w:t>Montagem do cenário temático no pátio do campus, com exposição dos itens aceitos, caixa de coleta e escala de acadêmicos para atendimento ao público; recolhimento e triagem semanal dos itens do campus e dos comércios parceiros; acerto semanal da rifa com a comissão financeira.</w:t>
+              <w:t>Montagem do cenário temático no pátio do campus, com exposição dos itens aceitos, caixa de coleta e escala de acadêmicos para atendimento ao público; recolhimento e triagem semanal dos itens do campus e dos comércios parceiros; acerto semanal da ação de arrecadação com a comissão financeira.</w:t>
             </w:r>
           </w:p>
           <w:p>
@@ -3042,7 +3042,7 @@
                 <w:i w:val="0"/>
                 <w:color w:val="444444"/>
               </w:rPr>
-              <w:t>ENCONTRO 9 – Balanço da Rifa e Aquisição do Prêmio</w:t>
+              <w:t>ENCONTRO 9 – Balanço da Ação de Arrecadação e Aquisição do Prêmio</w:t>
             </w:r>
           </w:p>
           <w:p>
@@ -3126,7 +3126,7 @@
                 <w:i w:val="0"/>
                 <w:color w:val="444444"/>
               </w:rPr>
-              <w:t>Relatório descritivo da participação no balanço da rifa ou na aquisição do prêmio.</w:t>
+              <w:t>Relatório descritivo da participação no balanço da ação de arrecadação ou na aquisição do prêmio.</w:t>
             </w:r>
           </w:p>
           <w:p/>
@@ -3590,7 +3590,7 @@
                 <w:i w:val="0"/>
                 <w:color w:val="444444"/>
               </w:rPr>
-              <w:t>ENCONTRO 13 – Encerramento da Rifa e Comunicação dos Resultados Parciais</w:t>
+              <w:t>ENCONTRO 13 – Encerramento da Ação de Arrecadação e Comunicação dos Resultados Parciais</w:t>
             </w:r>
           </w:p>
           <w:p>
@@ -3632,7 +3632,7 @@
                 <w:i w:val="0"/>
                 <w:color w:val="444444"/>
               </w:rPr>
-              <w:t>Encerrar a rifa com transparência e preparar a aquisição dos itens com os valores arrecadados.</w:t>
+              <w:t>Encerrar a ação de arrecadação com transparência e preparar a aquisição dos itens com os valores arrecadados.</w:t>
             </w:r>
           </w:p>
           <w:p>
@@ -3674,7 +3674,7 @@
                 <w:i w:val="0"/>
                 <w:color w:val="444444"/>
               </w:rPr>
-              <w:t>Relatório descritivo da participação no encerramento da rifa ou na comunicação dos resultados.</w:t>
+              <w:t>Relatório descritivo da participação no encerramento da ação de arrecadação ou na comunicação dos resultados.</w:t>
             </w:r>
           </w:p>
           <w:p/>
@@ -4049,7 +4049,7 @@
                 <w:i w:val="0"/>
                 <w:color w:val="444444"/>
               </w:rPr>
-              <w:t>Anexo 1 - Regulamento da campanha de arrecadação e da rifa solidária</w:t>
+              <w:t>Anexo 1 - Regulamento da campanha de doação de itens e da ação de arrecadação solidária</w:t>
             </w:r>
           </w:p>
         </w:tc>

</xml_diff>

<commit_message>
Acolhimento às famílias passa a ser café da manhã na unidade, em dia de visitação
Co-Authored-By: Claude Opus 5.5 <noreply@anthropic.com>
Claude-Session: https://claude.ai/code/session_01MBn9YrntdXfTASAVKo9hpN
</commit_message>
<xml_diff>
--- a/entregas/projeto-escrito.docx
+++ b/entregas/projeto-escrito.docx
@@ -1036,7 +1036,7 @@
                 <w:i w:val="0"/>
                 <w:color w:val="444444"/>
               </w:rPr>
-              <w:t>Objetivos específicos: (1) identificar a ocorrência do fenômeno "efeito rebote" como problema social; (2) observar, nas visitas técnicas, as condições de assistência material nas unidades; (3) promover o acolhimento às famílias daqueles em reclusão, por meio de roda de conversa; (4) realizar busca, arrecadação e campanhas de doação de insumos conforme a necessidade da PEM, da CCM e da CPIM; (5) estimular nos acadêmicos de Direito o pensamento crítico, humanístico e de cidadania; e (6) promover a responsabilidade social na comunidade por meio das redes sociais e das ações de mobilização.</w:t>
+              <w:t>Objetivos específicos: (1) identificar a ocorrência do fenômeno "efeito rebote" como problema social; (2) observar, nas visitas técnicas, as condições de assistência material nas unidades; (3) promover o acolhimento às famílias daqueles em reclusão, por meio de café da manhã de acolhimento realizado na unidade prisional em dia de visitação, com atenção às crianças; (4) realizar busca, arrecadação e campanhas de doação de insumos conforme a necessidade da PEM, da CCM e da CPIM; (5) estimular nos acadêmicos de Direito o pensamento crítico, humanístico e de cidadania; e (6) promover a responsabilidade social na comunidade por meio das redes sociais e das ações de mobilização.</w:t>
             </w:r>
           </w:p>
         </w:tc>
@@ -1389,7 +1389,7 @@
                 <w:i w:val="0"/>
                 <w:color w:val="444444"/>
               </w:rPr>
-              <w:t>Os encontros ocorrem semanalmente, às segundas-feiras, às 18h15, com acompanhamento da professora responsável e registro de frequência, totalizando 15 encontros: o 1º e o 2º destinam-se à construção do projeto; do 3º ao 13º, ao desenvolvimento das atividades conforme os encaminhamentos da turma; o 14º, às visitas técnicas; e o 15º, à discussão dos resultados e à elaboração do relatório final. O conteúdo de cada encontro está detalhado no cronograma. Algumas ações ocorrem fora do horário dos encontros, em datas próprias: o encerramento das vendas da ação de arrecadação (30/10), a publicação da lista de números (01/11), o sorteio transmitido ao vivo (02/11) e as visitas técnicas (04 e 05/11); os encontros correspondentes preparam e avaliam essas ações.</w:t>
+              <w:t>Os encontros ocorrem semanalmente, às segundas-feiras, às 18h15, com acompanhamento da professora responsável e registro de frequência, totalizando 15 encontros: o 1º e o 2º destinam-se à construção do projeto; do 3º ao 13º, ao desenvolvimento das atividades conforme os encaminhamentos da turma; o 14º, às visitas técnicas; e o 15º, à discussão dos resultados e à elaboração do relatório final. O conteúdo de cada encontro está detalhado no cronograma. Algumas ações ocorrem fora do horário dos encontros, em datas próprias: o encerramento das vendas da ação de arrecadação (30/10), a publicação da lista de números (01/11), o sorteio transmitido ao vivo (02/11), as visitas técnicas (04 e 05/11) e o café da manhã de acolhimento às famílias, em data a definir com a direção da unidade; os encontros correspondentes preparam e avaliam essas ações.</w:t>
             </w:r>
           </w:p>
           <w:p>
@@ -1515,7 +1515,7 @@
                 <w:i w:val="0"/>
                 <w:color w:val="444444"/>
               </w:rPr>
-              <w:t>Acolhimento às famílias. Será realizada uma roda de conversa com familiares de pessoas privadas de liberdade, conduzida pelos acadêmicos, com organização da acadêmica Francieli Araújo e mediação da professora responsável, em [PENDENTE: data e local; sugestão: dependências da UniCesumar], com divulgação feita em parceria com [PENDENTE: instituição que fará a ponte com as famílias, como o Conselho da Comunidade ou a Defensoria Pública] e mediante autorização das instâncias envolvidas. O encontro terá caráter de escuta e acolhimento e abordará, em linguagem acessível, os direitos da pessoa presa e de seus familiares (assistência material e à saúde, regras de visita) e os canais públicos de apoio. Regras: participação voluntária; sigilo sobre os relatos; nenhum registro de imagem ou dado que identifique os participantes, sendo a presença registrada apenas em número; e vedação de orientação jurídica individual pelos acadêmicos, com encaminhamento dos casos concretos à Defensoria Pública.</w:t>
+              <w:t>Acolhimento às famílias. Será realizado um café da manhã de acolhimento às famílias de pessoas privadas de liberdade, na própria unidade prisional e em dia de visitação, com atenção especial às crianças que visitam os pais nessa data. A ação será organizada pela acadêmica Francieli Araújo, com acompanhamento da professora responsável, em [PENDENTE: unidade e data, conforme o calendário de visitação definido pela direção da unidade], e depende de autorização prévia da direção da unidade e da instituição. Os alimentos serão obtidos por doações específicas, sem uso dos recursos da ação de arrecadação, que permanecem destinados exclusivamente aos itens de higiene, e seguirão as regras da unidade quanto aos produtos permitidos, às embalagens e à revista. O momento terá caráter de acolhimento e convivência: recepção das famílias, oferta do café da manhã, atenção às crianças e informação, em linguagem acessível, sobre os canais públicos de apoio aos familiares. Regras: participação voluntária; nenhum registro de imagem ou de dado que identifique familiares, crianças ou pessoas privadas de liberdade, em respeito à proteção integral da criança e do adolescente (BRASIL, 1990), sendo a presença registrada apenas em número; observância das normas de segurança e de conduta da unidade; e vedação de orientação jurídica individual pelos acadêmicos, com encaminhamento dos casos concretos à Defensoria Pública.</w:t>
             </w:r>
           </w:p>
           <w:p>
@@ -1571,7 +1571,7 @@
                 <w:i w:val="0"/>
                 <w:color w:val="444444"/>
               </w:rPr>
-              <w:t>Ajustes em relação ao pré-projeto aprovado. Esta versão mantém a fundamentação, os objetivos e a meta de referência de mais de 8.000 itens do pré-projeto (Anexo 3) e incorpora: (1) a lista atualizada de itens, que acrescenta o sabão em pó e define o limite de cada produto; como o pré-projeto especificava creme dental branco, a lista final (tipo, cor, embalagem e forma de entrega) será validada com a PEM, a CCM e a CPIM antes de qualquer aquisição; (2) a ação de arrecadação solidária como fonte complementar de recursos: a divulgação permanece de custo zero, e a receita da ação de arrecadação, deduzido o prêmio, destina-se exclusivamente à compra de itens; (3) as ações de mobilização e junto à sociedade, incluindo a roda de conversa com familiares; (4) o sistema on-line de controle de vendas e prestação de contas; e (5) a reformulação dos objetivos específicos e o tratamento do "efeito rebote" como categoria de análise fundamentada na literatura, sem pretensão de comprovar a relação entre prevenção e custos públicos, o que exigiria levantamento de dados alheio ao escopo da ação extensionista. O quantitativo arrecadado será acompanhado semanalmente em relação à meta, que depende principalmente das doações diretas; a receita da ação de arrecadação, deduzido o prêmio, tem caráter complementar.</w:t>
+              <w:t>Ajustes em relação ao pré-projeto aprovado. Esta versão mantém a fundamentação, os objetivos e a meta de referência de mais de 8.000 itens do pré-projeto (Anexo 3) e incorpora: (1) a lista atualizada de itens, que acrescenta o sabão em pó e define o limite de cada produto; como o pré-projeto especificava creme dental branco, a lista final (tipo, cor, embalagem e forma de entrega) será validada com a PEM, a CCM e a CPIM antes de qualquer aquisição; (2) a ação de arrecadação solidária como fonte complementar de recursos: a divulgação permanece de custo zero, e a receita da ação de arrecadação, deduzido o prêmio, destina-se exclusivamente à compra de itens; (3) as ações de mobilização e junto à sociedade, incluindo o café da manhã de acolhimento às famílias; (4) o sistema on-line de controle de vendas e prestação de contas; e (5) a reformulação dos objetivos específicos e o tratamento do "efeito rebote" como categoria de análise fundamentada na literatura, sem pretensão de comprovar a relação entre prevenção e custos públicos, o que exigiria levantamento de dados alheio ao escopo da ação extensionista. O quantitativo arrecadado será acompanhado semanalmente em relação à meta, que depende principalmente das doações diretas; a receita da ação de arrecadação, deduzido o prêmio, tem caráter complementar.</w:t>
             </w:r>
           </w:p>
         </w:tc>
@@ -1649,6 +1649,20 @@
                 <w:color w:val="444444"/>
               </w:rPr>
               <w:t>BRASIL. [Constituição (1988)]. Constituição da República Federativa do Brasil de 1988. Brasília, DF: Presidência da República, 1988.</w:t>
+            </w:r>
+          </w:p>
+          <w:p>
+            <w:pPr>
+              <w:spacing w:before="80"/>
+              <w:jc w:val="both"/>
+            </w:pPr>
+            <w:r>
+              <w:rPr>
+                <w:b w:val="0"/>
+                <w:i w:val="0"/>
+                <w:color w:val="444444"/>
+              </w:rPr>
+              <w:t>BRASIL. Lei nº 8.069, de 13 de julho de 1990. Dispõe sobre o Estatuto da Criança e do Adolescente e dá outras providências. Brasília, DF: Presidência da República, 1990.</w:t>
             </w:r>
           </w:p>
           <w:p>
@@ -2694,7 +2708,7 @@
                 <w:i w:val="0"/>
                 <w:color w:val="444444"/>
               </w:rPr>
-              <w:t>Pesquisa de dados (SENAPPEN, CNJ, Defensoria Pública do Paraná); produção de carrosséis e vídeos curtos; organização do calendário de três publicações semanais e envio prévio para aprovação; elaboração do roteiro da roda de conversa com familiares e contato com a instituição parceira para a divulgação.</w:t>
+              <w:t>Pesquisa de dados (SENAPPEN, CNJ, Defensoria Pública do Paraná); produção de carrosséis e vídeos curtos; organização do calendário de três publicações semanais e envio prévio para aprovação; início do planejamento do café da manhã de acolhimento às famílias e contato com a direção da unidade para autorização e definição da data.</w:t>
             </w:r>
           </w:p>
           <w:p>
@@ -3179,7 +3193,7 @@
                 <w:i w:val="0"/>
                 <w:color w:val="444444"/>
               </w:rPr>
-              <w:t>ENCONTRO 10 – Roda de Conversa com Familiares</w:t>
+              <w:t>ENCONTRO 10 – Preparação do Café da Manhã de Acolhimento às Famílias</w:t>
             </w:r>
           </w:p>
           <w:p>
@@ -3221,7 +3235,7 @@
                 <w:i w:val="0"/>
                 <w:color w:val="444444"/>
               </w:rPr>
-              <w:t>Acolher familiares de pessoas privadas de liberdade e compartilhar informações sobre direitos e canais públicos de apoio.</w:t>
+              <w:t>Organizar o café da manhã de acolhimento às famílias e às crianças que visitam os pais na unidade, conforme as regras da unidade.</w:t>
             </w:r>
           </w:p>
           <w:p>
@@ -3242,7 +3256,7 @@
                 <w:i w:val="0"/>
                 <w:color w:val="444444"/>
               </w:rPr>
-              <w:t>Recepção e escuta dos familiares; apresentação, em linguagem acessível, dos direitos relativos à assistência material, à saúde e às visitas; indicação dos canais de apoio (Defensoria Pública, Conselho da Comunidade); registro apenas do número de participantes, sem identificação.</w:t>
+              <w:t>Confirmação da autorização, da data e das regras da unidade (alimentos permitidos, embalagens, revista e número de acadêmicos); organização das doações de alimentos; divisão das tarefas; orientação da equipe sobre a conduta no acolhimento das famílias e das crianças e sobre a vedação de registros de imagem; após a ação, registro apenas do número de famílias e de crianças acolhidas.</w:t>
             </w:r>
           </w:p>
           <w:p>
@@ -3263,7 +3277,7 @@
                 <w:i w:val="0"/>
                 <w:color w:val="444444"/>
               </w:rPr>
-              <w:t>Relatório reflexivo sobre a escuta das famílias e a relação com o efeito rebote.</w:t>
+              <w:t>Relatório reflexivo sobre o acolhimento das famílias e a relação com o efeito rebote.</w:t>
             </w:r>
           </w:p>
           <w:p/>

</xml_diff>

<commit_message>
Detalha a prestação de contas em quatro componentes, conforme a prof.ª Camila
Co-Authored-By: Claude Opus 5.5 <noreply@anthropic.com>
Claude-Session: https://claude.ai/code/session_01MBn9YrntdXfTASAVKo9hpN
</commit_message>
<xml_diff>
--- a/entregas/projeto-escrito.docx
+++ b/entregas/projeto-escrito.docx
@@ -1571,7 +1571,21 @@
                 <w:i w:val="0"/>
                 <w:color w:val="444444"/>
               </w:rPr>
-              <w:t>Prestação de contas e frequência. A comissão financeira registra em planilha de controle, para cada acadêmico, a data e o valor do repasse identificado no extrato e a entrega dos canhotos; o saldo da conta deve corresponder ao número de blocos quitados multiplicado por R$ 150,00, somadas as doações em dinheiro e deduzidas as despesas, e toda despesa exige nota fiscal. O extrato da conta de uso exclusivo e a planilha compõem a prestação de contas, e um resumo dos valores arrecadados e gastos, sem dados pessoais, será divulgado no perfil do projeto, levando à sociedade o acompanhamento da ação. Ao final, será elaborado relatório de transparência com o quantitativo arrecadado e entregue por tipo de item e por unidade, o valor obtido com a ação de arrecadação, o total das doações em dinheiro e os comprovantes de compra. A frequência dos acadêmicos é registrada em cada encontro, e as entregas individuais descritas no cronograma compõem o relatório final do projeto.</w:t>
+              <w:t>Prestação de contas. Haverá prestação de contas de todas as frentes do projeto, e não apenas do valor financeiro, em quatro componentes: (1) ação de arrecadação: a comissão financeira registra em planilha de controle, para cada acadêmico, a data e o valor do repasse identificado no extrato e a entrega dos canhotos; (2) doações em dinheiro: registradas em planilha própria, com data, valor e identificação conforme o extrato; (3) compras: toda despesa exige nota fiscal, e a planilha relaciona cada compra aos itens adquiridos e às respectivas quantidades; e (4) itens arrecadados: a quantidade de cada item recebido nas caixas de coleta, registrada na triagem semanal, e a quantidade entregue a cada unidade, comprovada pelo termo de entrega. O saldo da conta deve corresponder ao número de blocos quitados multiplicado por R$ 150,00, somadas as doações em dinheiro e deduzidas as despesas. O extrato da conta de uso exclusivo, as planilhas, as notas fiscais e os termos de entrega compõem a prestação de contas, e um resumo dos valores arrecadados e gastos e dos itens arrecadados e entregues, sem dados pessoais, será divulgado no perfil do projeto, levando à sociedade o acompanhamento da ação. Ao final, será elaborado relatório de transparência, apresentado à professora responsável e à turma, com o quantitativo arrecadado e entregue por tipo de item e por unidade, o valor obtido com a ação de arrecadação, o total das doações em dinheiro e os comprovantes de compra.</w:t>
+            </w:r>
+          </w:p>
+          <w:p>
+            <w:pPr>
+              <w:spacing w:before="80"/>
+              <w:jc w:val="both"/>
+            </w:pPr>
+            <w:r>
+              <w:rPr>
+                <w:b w:val="0"/>
+                <w:i w:val="0"/>
+                <w:color w:val="444444"/>
+              </w:rPr>
+              <w:t>Frequência. A frequência dos acadêmicos é registrada em cada encontro, e as entregas individuais descritas no cronograma compõem o relatório final do projeto.</w:t>
             </w:r>
           </w:p>
           <w:p>

</xml_diff>